<commit_message>
Публикация прототипа из Flumos1/MLO@85e25894b4f9d84b7dd7fd35ae39322bb15260b8
</commit_message>
<xml_diff>
--- a/docs/09_Avtoreferat_RU.docx
+++ b/docs/09_Avtoreferat_RU.docx
@@ -1270,7 +1270,7 @@
                 <w:sz w:val="17"/>
                 <w:szCs w:val="17"/>
               </w:rPr>
-              <w:t xml:space="preserve">Расчётное ядро на Python, опубликованное в открытом репозитории MLO-core (более 60 автоматических тестов, эталонный тест рейтинга), прототип интерфейса в браузере, 9 отчётов в Word, сбор данных из 30+ открытых источников, протокол экспертной панели Дельфи</w:t>
+              <w:t xml:space="preserve">Расчётное ядро на Python (более 60 автоматических тестов, эталонный тест рейтинга; код закрыт до версии 1.0, рецензентам — по запросу), прототип интерфейса в браузере, 9 отчётов в Word, сбор данных из 30+ открытых источников, протокол экспертной панели Дельфи</w:t>
             </w:r>
           </w:p>
         </w:tc>
@@ -1692,7 +1692,7 @@
         <w:spacing w:after="60" w:line="276"/>
       </w:pPr>
       <w:r>
-        <w:t xml:space="preserve">Создать программный комплекс с открытым кодом, автоматическими тестами и интерфейсом.</w:t>
+        <w:t xml:space="preserve">Создать программный комплекс с автоматическими тестами и интерфейсом; методика, формулы и параметры открыты, код ядра закрыт до версии 1.0.</w:t>
       </w:r>
     </w:p>
     <w:p>
@@ -2056,7 +2056,7 @@
         <w:jc w:val="both"/>
       </w:pPr>
       <w:r>
-        <w:t xml:space="preserve">Достоверность обеспечена: открытым кодом (github.com/Flumos1/MLO-core) и данными; более чем 60 автоматическими тестами (проверка формул, модели боя, панели, калибровки) с запуском в GitHub Actions; сверкой расчёта в браузере с расчётом ядра; протоколами, зафиксированными до расчёта (коммиты 567224b, 65e1a59, 5ed015a, f2a1a3c, 67504ee, cb72541, 061ed46 и др.); публикацией отрицательных результатов. Материалы оформлены в 9 отчётах (документы 1–9) и интерактивном прототипе.</w:t>
+        <w:t xml:space="preserve">Достоверность обеспечена: открытыми формулами, параметрами и протоколами, данными с манифестом хешей (код ядра закрыт до версии 1.0, рецензентам — по запросу); более чем 60 автоматическими тестами (проверка формул, модели боя, панели, калибровки) с запуском в GitHub Actions; сверкой расчёта в браузере с расчётом ядра; протоколами, зафиксированными до расчёта (коммиты 567224b, 65e1a59, 5ed015a, f2a1a3c, 67504ee, cb72541, 061ed46 и др.); публикацией отрицательных результатов. Материалы оформлены в 9 отчётах (документы 1–9) и интерактивном прототипе.</w:t>
       </w:r>
     </w:p>
     <w:p>

</xml_diff>